<commit_message>
feat: implement data ingestion and ML training pipeline with historical price storage and calibration models
</commit_message>
<xml_diff>
--- a/خطوات التنفيذ.docx
+++ b/خطوات التنفيذ.docx
@@ -190,18 +190,202 @@
         </w:numPr>
       </w:pPr>
       <w:r>
-        <w:t>Download a free Dukascopy CSV file from </w:t>
-      </w:r>
-      <w:hyperlink r:id="rId5" w:history="1">
-        <w:r>
-          <w:rPr>
-            <w:rStyle w:val="Hyperlink"/>
-          </w:rPr>
-          <w:t>dukascopy.com/swiss/english/marketwatch/historical/</w:t>
-        </w:r>
-      </w:hyperlink>
-      <w:r>
-        <w:t> (free, no account needed) for EURUSD</w:t>
+        <w:t>Download a free CSV file for EURUSD</w:t>
+      </w:r>
+      <w:r>
+        <w:br/>
+      </w:r>
+      <w:r>
+        <w:t>To get the Historical Data in </w:t>
+      </w:r>
+      <w:r>
+        <w:rPr>
+          <w:b/>
+          <w:bCs/>
+        </w:rPr>
+        <w:t>MetaTrader 5</w:t>
+      </w:r>
+      <w:r>
+        <w:t>:</w:t>
+      </w:r>
+    </w:p>
+    <w:p>
+      <w:pPr>
+        <w:numPr>
+          <w:ilvl w:val="1"/>
+          <w:numId w:val="3"/>
+        </w:numPr>
+      </w:pPr>
+      <w:r>
+        <w:t>Press </w:t>
+      </w:r>
+      <w:r>
+        <w:rPr>
+          <w:b/>
+          <w:bCs/>
+        </w:rPr>
+        <w:t>Ctrl + U</w:t>
+      </w:r>
+      <w:r>
+        <w:t> on your keyboard (or click </w:t>
+      </w:r>
+      <w:r>
+        <w:rPr>
+          <w:b/>
+          <w:bCs/>
+        </w:rPr>
+        <w:t>View</w:t>
+      </w:r>
+      <w:r>
+        <w:t> -&gt; </w:t>
+      </w:r>
+      <w:r>
+        <w:rPr>
+          <w:b/>
+          <w:bCs/>
+        </w:rPr>
+        <w:t>Symbols</w:t>
+      </w:r>
+      <w:r>
+        <w:t> in the top menu).</w:t>
+      </w:r>
+    </w:p>
+    <w:p>
+      <w:pPr>
+        <w:numPr>
+          <w:ilvl w:val="1"/>
+          <w:numId w:val="3"/>
+        </w:numPr>
+      </w:pPr>
+      <w:r>
+        <w:t>A "Symbols" window will pop up.</w:t>
+      </w:r>
+    </w:p>
+    <w:p>
+      <w:pPr>
+        <w:numPr>
+          <w:ilvl w:val="1"/>
+          <w:numId w:val="3"/>
+        </w:numPr>
+      </w:pPr>
+      <w:r>
+        <w:t>Click the </w:t>
+      </w:r>
+      <w:r>
+        <w:rPr>
+          <w:b/>
+          <w:bCs/>
+        </w:rPr>
+        <w:t>"Bars"</w:t>
+      </w:r>
+      <w:r>
+        <w:t> tab at the top of that window.</w:t>
+      </w:r>
+    </w:p>
+    <w:p>
+      <w:pPr>
+        <w:numPr>
+          <w:ilvl w:val="1"/>
+          <w:numId w:val="3"/>
+        </w:numPr>
+      </w:pPr>
+      <w:r>
+        <w:t>On the left side, search for or click on </w:t>
+      </w:r>
+      <w:r>
+        <w:rPr>
+          <w:b/>
+          <w:bCs/>
+        </w:rPr>
+        <w:t>EURUSD</w:t>
+      </w:r>
+      <w:r>
+        <w:t>.</w:t>
+      </w:r>
+    </w:p>
+    <w:p>
+      <w:pPr>
+        <w:numPr>
+          <w:ilvl w:val="1"/>
+          <w:numId w:val="3"/>
+        </w:numPr>
+      </w:pPr>
+      <w:r>
+        <w:t>Select the Timeframe you want (e.g., </w:t>
+      </w:r>
+      <w:r>
+        <w:rPr>
+          <w:b/>
+          <w:bCs/>
+        </w:rPr>
+        <w:t>"H1"</w:t>
+      </w:r>
+      <w:r>
+        <w:t>).</w:t>
+      </w:r>
+    </w:p>
+    <w:p>
+      <w:pPr>
+        <w:numPr>
+          <w:ilvl w:val="1"/>
+          <w:numId w:val="3"/>
+        </w:numPr>
+      </w:pPr>
+      <w:r>
+        <w:lastRenderedPageBreak/>
+        <w:t>Click the </w:t>
+      </w:r>
+      <w:r>
+        <w:rPr>
+          <w:b/>
+          <w:bCs/>
+        </w:rPr>
+        <w:t>"Request"</w:t>
+      </w:r>
+      <w:r>
+        <w:t> button to load the history.</w:t>
+      </w:r>
+    </w:p>
+    <w:p>
+      <w:pPr>
+        <w:numPr>
+          <w:ilvl w:val="1"/>
+          <w:numId w:val="3"/>
+        </w:numPr>
+      </w:pPr>
+      <w:r>
+        <w:t>Click the </w:t>
+      </w:r>
+      <w:r>
+        <w:rPr>
+          <w:b/>
+          <w:bCs/>
+        </w:rPr>
+        <w:t>"Export"</w:t>
+      </w:r>
+      <w:r>
+        <w:t> button to save the .csv file.</w:t>
+      </w:r>
+    </w:p>
+    <w:p>
+      <w:pPr>
+        <w:numPr>
+          <w:ilvl w:val="1"/>
+          <w:numId w:val="3"/>
+        </w:numPr>
+      </w:pPr>
+      <w:r>
+        <w:t>Try </w:t>
+      </w:r>
+      <w:r>
+        <w:rPr>
+          <w:b/>
+          <w:bCs/>
+        </w:rPr>
+        <w:t>Ctrl + U</w:t>
+      </w:r>
+      <w:r>
+        <w:t> and let me know if you see the Symbols window!</w:t>
       </w:r>
     </w:p>
     <w:p>
@@ -214,6 +398,126 @@
       <w:r>
         <w:t>Place it in d:\foreks\data\ folder</w:t>
       </w:r>
+      <w:r>
+        <w:br/>
+      </w:r>
+      <w:r>
+        <w:br/>
+      </w:r>
+      <w:r>
+        <w:t>For our AI bot, the most important timeframe is </w:t>
+      </w:r>
+      <w:r>
+        <w:rPr>
+          <w:b/>
+          <w:bCs/>
+        </w:rPr>
+        <w:t>H1 (1 Hour)</w:t>
+      </w:r>
+      <w:r>
+        <w:t> because that's what the AI Brain uses to calculate the main trends.</w:t>
+      </w:r>
+    </w:p>
+    <w:p>
+      <w:pPr>
+        <w:ind w:left="720"/>
+      </w:pPr>
+      <w:r>
+        <w:t>Go ahead and select </w:t>
+      </w:r>
+      <w:r>
+        <w:rPr>
+          <w:b/>
+          <w:bCs/>
+        </w:rPr>
+        <w:t>H1</w:t>
+      </w:r>
+      <w:r>
+        <w:t> from the timeframe dropdown, click Request, and Export that file.</w:t>
+      </w:r>
+    </w:p>
+    <w:p>
+      <w:pPr>
+        <w:ind w:left="720"/>
+      </w:pPr>
+      <w:r>
+        <w:t>If you want to run a </w:t>
+      </w:r>
+      <w:r>
+        <w:rPr>
+          <w:i/>
+          <w:iCs/>
+        </w:rPr>
+        <w:t>perfect</w:t>
+      </w:r>
+      <w:r>
+        <w:t> multi-timeframe backtest later, you will eventually want to export 4 files for EURUSD:</w:t>
+      </w:r>
+    </w:p>
+    <w:p>
+      <w:pPr>
+        <w:ind w:left="720"/>
+      </w:pPr>
+      <w:r>
+        <w:rPr>
+          <w:b/>
+          <w:bCs/>
+        </w:rPr>
+        <w:t>M15</w:t>
+      </w:r>
+      <w:r>
+        <w:t> (15 Minutes)</w:t>
+      </w:r>
+    </w:p>
+    <w:p>
+      <w:pPr>
+        <w:ind w:left="720"/>
+      </w:pPr>
+      <w:r>
+        <w:rPr>
+          <w:b/>
+          <w:bCs/>
+        </w:rPr>
+        <w:t>H1</w:t>
+      </w:r>
+      <w:r>
+        <w:t> (1 Hour)</w:t>
+      </w:r>
+    </w:p>
+    <w:p>
+      <w:pPr>
+        <w:ind w:left="720"/>
+      </w:pPr>
+      <w:r>
+        <w:rPr>
+          <w:b/>
+          <w:bCs/>
+        </w:rPr>
+        <w:t>H4</w:t>
+      </w:r>
+      <w:r>
+        <w:t> (4 Hours)</w:t>
+      </w:r>
+    </w:p>
+    <w:p>
+      <w:pPr>
+        <w:ind w:left="720"/>
+      </w:pPr>
+      <w:r>
+        <w:rPr>
+          <w:b/>
+          <w:bCs/>
+        </w:rPr>
+        <w:t>D1</w:t>
+      </w:r>
+      <w:r>
+        <w:t> (Daily)</w:t>
+      </w:r>
+    </w:p>
+    <w:p>
+      <w:pPr>
+        <w:ind w:left="720"/>
+      </w:pPr>
     </w:p>
     <w:p>
       <w:pPr>
@@ -223,6 +527,23 @@
         </w:numPr>
       </w:pPr>
       <w:r>
+        <w:t>run the import script to process them all and begin backtesting!</w:t>
+      </w:r>
+      <w:r>
+        <w:br/>
+      </w:r>
+      <w:r>
+        <w:t>docker-compose exec -T web python scripts/ingest_historical.py</w:t>
+      </w:r>
+    </w:p>
+    <w:p>
+      <w:pPr>
+        <w:numPr>
+          <w:ilvl w:val="0"/>
+          <w:numId w:val="3"/>
+        </w:numPr>
+      </w:pPr>
+      <w:r>
         <w:t>Run the backtester to see how the bot would have performed over the past year</w:t>
       </w:r>
     </w:p>
@@ -244,18 +565,18 @@
     </w:p>
     <w:p>
       <w:r>
+        <w:t>Stage 4: The Go-Live Checklist</w:t>
+      </w:r>
+    </w:p>
+    <w:p>
+      <w:r>
+        <w:t>The plan has a strict gate — you must pass ALL of these before using real money:</w:t>
+      </w:r>
+    </w:p>
+    <w:p/>
+    <w:p>
+      <w:r>
         <w:lastRenderedPageBreak/>
-        <w:t>Stage 4: The Go-Live Checklist</w:t>
-      </w:r>
-    </w:p>
-    <w:p>
-      <w:r>
-        <w:t>The plan has a strict gate — you must pass ALL of these before using real money:</w:t>
-      </w:r>
-    </w:p>
-    <w:p/>
-    <w:p>
-      <w:r>
         <w:t>Check</w:t>
       </w:r>
       <w:r>
@@ -282,7 +603,7 @@
                     <pic:cNvPicPr/>
                   </pic:nvPicPr>
                   <pic:blipFill>
-                    <a:blip r:embed="rId6"/>
+                    <a:blip r:embed="rId5"/>
                     <a:stretch>
                       <a:fillRect/>
                     </a:stretch>
@@ -440,7 +761,6 @@
         <w:t>Only when ALL checks pass:</w:t>
       </w:r>
     </w:p>
-    <w:p/>
     <w:p>
       <w:r>
         <w:t>Change .env: PAPER_TRADING_MODE=false</w:t>
@@ -448,7 +768,6 @@
     </w:p>
     <w:p>
       <w:r>
-        <w:lastRenderedPageBreak/>
         <w:t>Start with 0.01 lot size (micro lots) — minimum possible</w:t>
       </w:r>
     </w:p>
@@ -492,6 +811,348 @@
 <file path=word/numbering.xml><?xml version="1.0" encoding="utf-8"?>
 <w:numbering xmlns:wpc="http://schemas.microsoft.com/office/word/2010/wordprocessingCanvas" xmlns:cx="http://schemas.microsoft.com/office/drawing/2014/chartex" xmlns:cx1="http://schemas.microsoft.com/office/drawing/2015/9/8/chartex" xmlns:cx2="http://schemas.microsoft.com/office/drawing/2015/10/21/chartex" xmlns:cx3="http://schemas.microsoft.com/office/drawing/2016/5/9/chartex" xmlns:cx4="http://schemas.microsoft.com/office/drawing/2016/5/10/chartex" xmlns:cx5="http://schemas.microsoft.com/office/drawing/2016/5/11/chartex" xmlns:cx6="http://schemas.microsoft.com/office/drawing/2016/5/12/chartex" xmlns:cx7="http://schemas.microsoft.com/office/drawing/2016/5/13/chartex" xmlns:cx8="http://schemas.microsoft.com/office/drawing/2016/5/14/chartex" xmlns:mc="http://schemas.openxmlformats.org/markup-compatibility/2006" xmlns:aink="http://schemas.microsoft.com/office/drawing/2016/ink" xmlns:am3d="http://schemas.microsoft.com/office/drawing/2017/model3d" xmlns:o="urn:schemas-microsoft-com:office:office" xmlns:oel="http://schemas.microsoft.com/office/2019/extlst" xmlns:r="http://schemas.openxmlformats.org/officeDocument/2006/relationships" xmlns:m="http://schemas.openxmlformats.org/officeDocument/2006/math" xmlns:v="urn:schemas-microsoft-com:vml" xmlns:wp14="http://schemas.microsoft.com/office/word/2010/wordprocessingDrawing" xmlns:wp="http://schemas.openxmlformats.org/drawingml/2006/wordprocessingDrawing" xmlns:w10="urn:schemas-microsoft-com:office:word" xmlns:w="http://schemas.openxmlformats.org/wordprocessingml/2006/main" xmlns:w14="http://schemas.microsoft.com/office/word/2010/wordml" xmlns:w15="http://schemas.microsoft.com/office/word/2012/wordml" xmlns:w16cex="http://schemas.microsoft.com/office/word/2018/wordml/cex" xmlns:w16cid="http://schemas.microsoft.com/office/word/2016/wordml/cid" xmlns:w16="http://schemas.microsoft.com/office/word/2018/wordml" xmlns:w16sdtdh="http://schemas.microsoft.com/office/word/2020/wordml/sdtdatahash" xmlns:w16se="http://schemas.microsoft.com/office/word/2015/wordml/symex" xmlns:wpg="http://schemas.microsoft.com/office/word/2010/wordprocessingGroup" xmlns:wpi="http://schemas.microsoft.com/office/word/2010/wordprocessingInk" xmlns:wne="http://schemas.microsoft.com/office/word/2006/wordml" xmlns:wps="http://schemas.microsoft.com/office/word/2010/wordprocessingShape" mc:Ignorable="w14 w15 w16se w16cid w16 w16cex w16sdtdh wp14">
   <w:abstractNum w:abstractNumId="0" w15:restartNumberingAfterBreak="0">
+    <w:nsid w:val="214E7509"/>
+    <w:multiLevelType w:val="multilevel"/>
+    <w:tmpl w:val="FF7CD4DA"/>
+    <w:lvl w:ilvl="0">
+      <w:start w:val="1"/>
+      <w:numFmt w:val="bullet"/>
+      <w:lvlText w:val=""/>
+      <w:lvlJc w:val="left"/>
+      <w:pPr>
+        <w:tabs>
+          <w:tab w:val="num" w:pos="720"/>
+        </w:tabs>
+        <w:ind w:left="720" w:hanging="360"/>
+      </w:pPr>
+      <w:rPr>
+        <w:rFonts w:ascii="Symbol" w:hAnsi="Symbol" w:hint="default"/>
+      </w:rPr>
+    </w:lvl>
+    <w:lvl w:ilvl="1">
+      <w:start w:val="1"/>
+      <w:numFmt w:val="decimal"/>
+      <w:lvlText w:val="%2."/>
+      <w:lvlJc w:val="left"/>
+      <w:pPr>
+        <w:tabs>
+          <w:tab w:val="num" w:pos="1440"/>
+        </w:tabs>
+        <w:ind w:left="1440" w:hanging="360"/>
+      </w:pPr>
+    </w:lvl>
+    <w:lvl w:ilvl="2" w:tentative="1">
+      <w:start w:val="1"/>
+      <w:numFmt w:val="decimal"/>
+      <w:lvlText w:val="%3."/>
+      <w:lvlJc w:val="left"/>
+      <w:pPr>
+        <w:tabs>
+          <w:tab w:val="num" w:pos="2160"/>
+        </w:tabs>
+        <w:ind w:left="2160" w:hanging="360"/>
+      </w:pPr>
+    </w:lvl>
+    <w:lvl w:ilvl="3" w:tentative="1">
+      <w:start w:val="1"/>
+      <w:numFmt w:val="decimal"/>
+      <w:lvlText w:val="%4."/>
+      <w:lvlJc w:val="left"/>
+      <w:pPr>
+        <w:tabs>
+          <w:tab w:val="num" w:pos="2880"/>
+        </w:tabs>
+        <w:ind w:left="2880" w:hanging="360"/>
+      </w:pPr>
+    </w:lvl>
+    <w:lvl w:ilvl="4" w:tentative="1">
+      <w:start w:val="1"/>
+      <w:numFmt w:val="decimal"/>
+      <w:lvlText w:val="%5."/>
+      <w:lvlJc w:val="left"/>
+      <w:pPr>
+        <w:tabs>
+          <w:tab w:val="num" w:pos="3600"/>
+        </w:tabs>
+        <w:ind w:left="3600" w:hanging="360"/>
+      </w:pPr>
+    </w:lvl>
+    <w:lvl w:ilvl="5" w:tentative="1">
+      <w:start w:val="1"/>
+      <w:numFmt w:val="decimal"/>
+      <w:lvlText w:val="%6."/>
+      <w:lvlJc w:val="left"/>
+      <w:pPr>
+        <w:tabs>
+          <w:tab w:val="num" w:pos="4320"/>
+        </w:tabs>
+        <w:ind w:left="4320" w:hanging="360"/>
+      </w:pPr>
+    </w:lvl>
+    <w:lvl w:ilvl="6" w:tentative="1">
+      <w:start w:val="1"/>
+      <w:numFmt w:val="decimal"/>
+      <w:lvlText w:val="%7."/>
+      <w:lvlJc w:val="left"/>
+      <w:pPr>
+        <w:tabs>
+          <w:tab w:val="num" w:pos="5040"/>
+        </w:tabs>
+        <w:ind w:left="5040" w:hanging="360"/>
+      </w:pPr>
+    </w:lvl>
+    <w:lvl w:ilvl="7" w:tentative="1">
+      <w:start w:val="1"/>
+      <w:numFmt w:val="decimal"/>
+      <w:lvlText w:val="%8."/>
+      <w:lvlJc w:val="left"/>
+      <w:pPr>
+        <w:tabs>
+          <w:tab w:val="num" w:pos="5760"/>
+        </w:tabs>
+        <w:ind w:left="5760" w:hanging="360"/>
+      </w:pPr>
+    </w:lvl>
+    <w:lvl w:ilvl="8" w:tentative="1">
+      <w:start w:val="1"/>
+      <w:numFmt w:val="decimal"/>
+      <w:lvlText w:val="%9."/>
+      <w:lvlJc w:val="left"/>
+      <w:pPr>
+        <w:tabs>
+          <w:tab w:val="num" w:pos="6480"/>
+        </w:tabs>
+        <w:ind w:left="6480" w:hanging="360"/>
+      </w:pPr>
+    </w:lvl>
+  </w:abstractNum>
+  <w:abstractNum w:abstractNumId="1" w15:restartNumberingAfterBreak="0">
+    <w:nsid w:val="25E45AAE"/>
+    <w:multiLevelType w:val="multilevel"/>
+    <w:tmpl w:val="1E32DE0A"/>
+    <w:lvl w:ilvl="0">
+      <w:start w:val="1"/>
+      <w:numFmt w:val="decimal"/>
+      <w:lvlText w:val="%1."/>
+      <w:lvlJc w:val="left"/>
+      <w:pPr>
+        <w:tabs>
+          <w:tab w:val="num" w:pos="720"/>
+        </w:tabs>
+        <w:ind w:left="720" w:hanging="360"/>
+      </w:pPr>
+    </w:lvl>
+    <w:lvl w:ilvl="1" w:tentative="1">
+      <w:start w:val="1"/>
+      <w:numFmt w:val="decimal"/>
+      <w:lvlText w:val="%2."/>
+      <w:lvlJc w:val="left"/>
+      <w:pPr>
+        <w:tabs>
+          <w:tab w:val="num" w:pos="1440"/>
+        </w:tabs>
+        <w:ind w:left="1440" w:hanging="360"/>
+      </w:pPr>
+    </w:lvl>
+    <w:lvl w:ilvl="2" w:tentative="1">
+      <w:start w:val="1"/>
+      <w:numFmt w:val="decimal"/>
+      <w:lvlText w:val="%3."/>
+      <w:lvlJc w:val="left"/>
+      <w:pPr>
+        <w:tabs>
+          <w:tab w:val="num" w:pos="2160"/>
+        </w:tabs>
+        <w:ind w:left="2160" w:hanging="360"/>
+      </w:pPr>
+    </w:lvl>
+    <w:lvl w:ilvl="3" w:tentative="1">
+      <w:start w:val="1"/>
+      <w:numFmt w:val="decimal"/>
+      <w:lvlText w:val="%4."/>
+      <w:lvlJc w:val="left"/>
+      <w:pPr>
+        <w:tabs>
+          <w:tab w:val="num" w:pos="2880"/>
+        </w:tabs>
+        <w:ind w:left="2880" w:hanging="360"/>
+      </w:pPr>
+    </w:lvl>
+    <w:lvl w:ilvl="4" w:tentative="1">
+      <w:start w:val="1"/>
+      <w:numFmt w:val="decimal"/>
+      <w:lvlText w:val="%5."/>
+      <w:lvlJc w:val="left"/>
+      <w:pPr>
+        <w:tabs>
+          <w:tab w:val="num" w:pos="3600"/>
+        </w:tabs>
+        <w:ind w:left="3600" w:hanging="360"/>
+      </w:pPr>
+    </w:lvl>
+    <w:lvl w:ilvl="5" w:tentative="1">
+      <w:start w:val="1"/>
+      <w:numFmt w:val="decimal"/>
+      <w:lvlText w:val="%6."/>
+      <w:lvlJc w:val="left"/>
+      <w:pPr>
+        <w:tabs>
+          <w:tab w:val="num" w:pos="4320"/>
+        </w:tabs>
+        <w:ind w:left="4320" w:hanging="360"/>
+      </w:pPr>
+    </w:lvl>
+    <w:lvl w:ilvl="6" w:tentative="1">
+      <w:start w:val="1"/>
+      <w:numFmt w:val="decimal"/>
+      <w:lvlText w:val="%7."/>
+      <w:lvlJc w:val="left"/>
+      <w:pPr>
+        <w:tabs>
+          <w:tab w:val="num" w:pos="5040"/>
+        </w:tabs>
+        <w:ind w:left="5040" w:hanging="360"/>
+      </w:pPr>
+    </w:lvl>
+    <w:lvl w:ilvl="7" w:tentative="1">
+      <w:start w:val="1"/>
+      <w:numFmt w:val="decimal"/>
+      <w:lvlText w:val="%8."/>
+      <w:lvlJc w:val="left"/>
+      <w:pPr>
+        <w:tabs>
+          <w:tab w:val="num" w:pos="5760"/>
+        </w:tabs>
+        <w:ind w:left="5760" w:hanging="360"/>
+      </w:pPr>
+    </w:lvl>
+    <w:lvl w:ilvl="8" w:tentative="1">
+      <w:start w:val="1"/>
+      <w:numFmt w:val="decimal"/>
+      <w:lvlText w:val="%9."/>
+      <w:lvlJc w:val="left"/>
+      <w:pPr>
+        <w:tabs>
+          <w:tab w:val="num" w:pos="6480"/>
+        </w:tabs>
+        <w:ind w:left="6480" w:hanging="360"/>
+      </w:pPr>
+    </w:lvl>
+  </w:abstractNum>
+  <w:abstractNum w:abstractNumId="2" w15:restartNumberingAfterBreak="0">
+    <w:nsid w:val="55FC6596"/>
+    <w:multiLevelType w:val="multilevel"/>
+    <w:tmpl w:val="DD5EEBBC"/>
+    <w:lvl w:ilvl="0">
+      <w:start w:val="1"/>
+      <w:numFmt w:val="decimal"/>
+      <w:lvlText w:val="%1."/>
+      <w:lvlJc w:val="left"/>
+      <w:pPr>
+        <w:tabs>
+          <w:tab w:val="num" w:pos="720"/>
+        </w:tabs>
+        <w:ind w:left="720" w:hanging="360"/>
+      </w:pPr>
+    </w:lvl>
+    <w:lvl w:ilvl="1" w:tentative="1">
+      <w:start w:val="1"/>
+      <w:numFmt w:val="decimal"/>
+      <w:lvlText w:val="%2."/>
+      <w:lvlJc w:val="left"/>
+      <w:pPr>
+        <w:tabs>
+          <w:tab w:val="num" w:pos="1440"/>
+        </w:tabs>
+        <w:ind w:left="1440" w:hanging="360"/>
+      </w:pPr>
+    </w:lvl>
+    <w:lvl w:ilvl="2" w:tentative="1">
+      <w:start w:val="1"/>
+      <w:numFmt w:val="decimal"/>
+      <w:lvlText w:val="%3."/>
+      <w:lvlJc w:val="left"/>
+      <w:pPr>
+        <w:tabs>
+          <w:tab w:val="num" w:pos="2160"/>
+        </w:tabs>
+        <w:ind w:left="2160" w:hanging="360"/>
+      </w:pPr>
+    </w:lvl>
+    <w:lvl w:ilvl="3" w:tentative="1">
+      <w:start w:val="1"/>
+      <w:numFmt w:val="decimal"/>
+      <w:lvlText w:val="%4."/>
+      <w:lvlJc w:val="left"/>
+      <w:pPr>
+        <w:tabs>
+          <w:tab w:val="num" w:pos="2880"/>
+        </w:tabs>
+        <w:ind w:left="2880" w:hanging="360"/>
+      </w:pPr>
+    </w:lvl>
+    <w:lvl w:ilvl="4" w:tentative="1">
+      <w:start w:val="1"/>
+      <w:numFmt w:val="decimal"/>
+      <w:lvlText w:val="%5."/>
+      <w:lvlJc w:val="left"/>
+      <w:pPr>
+        <w:tabs>
+          <w:tab w:val="num" w:pos="3600"/>
+        </w:tabs>
+        <w:ind w:left="3600" w:hanging="360"/>
+      </w:pPr>
+    </w:lvl>
+    <w:lvl w:ilvl="5" w:tentative="1">
+      <w:start w:val="1"/>
+      <w:numFmt w:val="decimal"/>
+      <w:lvlText w:val="%6."/>
+      <w:lvlJc w:val="left"/>
+      <w:pPr>
+        <w:tabs>
+          <w:tab w:val="num" w:pos="4320"/>
+        </w:tabs>
+        <w:ind w:left="4320" w:hanging="360"/>
+      </w:pPr>
+    </w:lvl>
+    <w:lvl w:ilvl="6" w:tentative="1">
+      <w:start w:val="1"/>
+      <w:numFmt w:val="decimal"/>
+      <w:lvlText w:val="%7."/>
+      <w:lvlJc w:val="left"/>
+      <w:pPr>
+        <w:tabs>
+          <w:tab w:val="num" w:pos="5040"/>
+        </w:tabs>
+        <w:ind w:left="5040" w:hanging="360"/>
+      </w:pPr>
+    </w:lvl>
+    <w:lvl w:ilvl="7" w:tentative="1">
+      <w:start w:val="1"/>
+      <w:numFmt w:val="decimal"/>
+      <w:lvlText w:val="%8."/>
+      <w:lvlJc w:val="left"/>
+      <w:pPr>
+        <w:tabs>
+          <w:tab w:val="num" w:pos="5760"/>
+        </w:tabs>
+        <w:ind w:left="5760" w:hanging="360"/>
+      </w:pPr>
+    </w:lvl>
+    <w:lvl w:ilvl="8" w:tentative="1">
+      <w:start w:val="1"/>
+      <w:numFmt w:val="decimal"/>
+      <w:lvlText w:val="%9."/>
+      <w:lvlJc w:val="left"/>
+      <w:pPr>
+        <w:tabs>
+          <w:tab w:val="num" w:pos="6480"/>
+        </w:tabs>
+        <w:ind w:left="6480" w:hanging="360"/>
+      </w:pPr>
+    </w:lvl>
+  </w:abstractNum>
+  <w:abstractNum w:abstractNumId="3" w15:restartNumberingAfterBreak="0">
     <w:nsid w:val="5F256934"/>
     <w:multiLevelType w:val="multilevel"/>
     <w:tmpl w:val="57FE090A"/>
@@ -604,7 +1265,7 @@
       </w:pPr>
     </w:lvl>
   </w:abstractNum>
-  <w:abstractNum w:abstractNumId="1" w15:restartNumberingAfterBreak="0">
+  <w:abstractNum w:abstractNumId="4" w15:restartNumberingAfterBreak="0">
     <w:nsid w:val="6E352563"/>
     <w:multiLevelType w:val="multilevel"/>
     <w:tmpl w:val="238E7BB2"/>
@@ -620,7 +1281,7 @@
         <w:ind w:left="720" w:hanging="360"/>
       </w:pPr>
     </w:lvl>
-    <w:lvl w:ilvl="1" w:tentative="1">
+    <w:lvl w:ilvl="1">
       <w:start w:val="1"/>
       <w:numFmt w:val="decimal"/>
       <w:lvlText w:val="%2."/>
@@ -717,7 +1378,7 @@
       </w:pPr>
     </w:lvl>
   </w:abstractNum>
-  <w:abstractNum w:abstractNumId="2" w15:restartNumberingAfterBreak="0">
+  <w:abstractNum w:abstractNumId="5" w15:restartNumberingAfterBreak="0">
     <w:nsid w:val="7F62276D"/>
     <w:multiLevelType w:val="multilevel"/>
     <w:tmpl w:val="51A49A62"/>
@@ -831,13 +1492,22 @@
     </w:lvl>
   </w:abstractNum>
   <w:num w:numId="1" w16cid:durableId="668289501">
+    <w:abstractNumId w:val="5"/>
+  </w:num>
+  <w:num w:numId="2" w16cid:durableId="501698854">
+    <w:abstractNumId w:val="3"/>
+  </w:num>
+  <w:num w:numId="3" w16cid:durableId="1718771339">
+    <w:abstractNumId w:val="4"/>
+  </w:num>
+  <w:num w:numId="4" w16cid:durableId="175965564">
     <w:abstractNumId w:val="2"/>
   </w:num>
-  <w:num w:numId="2" w16cid:durableId="501698854">
+  <w:num w:numId="5" w16cid:durableId="1834105886">
+    <w:abstractNumId w:val="1"/>
+  </w:num>
+  <w:num w:numId="6" w16cid:durableId="427507635">
     <w:abstractNumId w:val="0"/>
-  </w:num>
-  <w:num w:numId="3" w16cid:durableId="1718771339">
-    <w:abstractNumId w:val="1"/>
   </w:num>
 </w:numbering>
 </file>
@@ -1781,6 +2451,47 @@
       <w:shd w:val="clear" w:color="auto" w:fill="E1DFDD"/>
     </w:rPr>
   </w:style>
+  <w:style w:type="paragraph" w:styleId="NormalWeb">
+    <w:name w:val="Normal (Web)"/>
+    <w:basedOn w:val="Normal"/>
+    <w:uiPriority w:val="99"/>
+    <w:semiHidden/>
+    <w:unhideWhenUsed/>
+    <w:rsid w:val="00243C3C"/>
+    <w:rPr>
+      <w:rFonts w:ascii="Times New Roman" w:hAnsi="Times New Roman" w:cs="Times New Roman"/>
+    </w:rPr>
+  </w:style>
+  <w:style w:type="paragraph" w:styleId="HTMLPreformatted">
+    <w:name w:val="HTML Preformatted"/>
+    <w:basedOn w:val="Normal"/>
+    <w:link w:val="HTMLPreformattedChar"/>
+    <w:uiPriority w:val="99"/>
+    <w:semiHidden/>
+    <w:unhideWhenUsed/>
+    <w:rsid w:val="00243C3C"/>
+    <w:pPr>
+      <w:spacing w:after="0" w:line="240" w:lineRule="auto"/>
+    </w:pPr>
+    <w:rPr>
+      <w:rFonts w:ascii="Consolas" w:hAnsi="Consolas"/>
+      <w:sz w:val="20"/>
+      <w:szCs w:val="20"/>
+    </w:rPr>
+  </w:style>
+  <w:style w:type="character" w:customStyle="1" w:styleId="HTMLPreformattedChar">
+    <w:name w:val="HTML Preformatted Char"/>
+    <w:basedOn w:val="DefaultParagraphFont"/>
+    <w:link w:val="HTMLPreformatted"/>
+    <w:uiPriority w:val="99"/>
+    <w:semiHidden/>
+    <w:rsid w:val="00243C3C"/>
+    <w:rPr>
+      <w:rFonts w:ascii="Consolas" w:hAnsi="Consolas"/>
+      <w:sz w:val="20"/>
+      <w:szCs w:val="20"/>
+    </w:rPr>
+  </w:style>
 </w:styles>
 </file>
 

</xml_diff>